<commit_message>
upload paper report and slides
</commit_message>
<xml_diff>
--- a/docs/Evaluation.docx
+++ b/docs/Evaluation.docx
@@ -468,8 +468,8 @@
       <w:pPr>
         <w:jc w:val="left"/>
         <w:rPr>
-          <w:rFonts w:hint="default" w:eastAsiaTheme="minorEastAsia"/>
-          <w:lang w:val="en-US" w:eastAsia="zh-CN"/>
+          <w:rFonts w:hint="default"/>
+          <w:lang w:val="en-US"/>
         </w:rPr>
       </w:pPr>
       <w:r>
@@ -522,16 +522,8 @@
           <w:rFonts w:hint="eastAsia"/>
           <w:lang w:val="en-US" w:eastAsia="zh-CN"/>
         </w:rPr>
-        <w:t>但是早期反射的标准时间是由目测IR waveform形状得到的，存在一定范围的不准确性。并且，学术上目前没有能够完全精确计算早期反射时间的方法，所以它的标准值建立在经验的基础上得出的。</w:t>
-      </w:r>
-    </w:p>
-    <w:p>
-      <w:pPr>
-        <w:jc w:val="left"/>
-        <w:rPr>
-          <w:rFonts w:hint="eastAsia"/>
-        </w:rPr>
-      </w:pPr>
+        <w:t>The standards of direct sound arrival time is according to ISO 3382, direct sound is defined as the sound arriving via the shortest path without reflections, while reflected sound includes all subsequent arrivals.And early reflection time is not clearly defined in ISO, but Clarity indices C50 and C80 are defined in ISO 3382-1 as energy ratios between early and late sound, using time limits of 50 ms and 80 ms respectively. So temporal windows (e.g., 50 ms to 80 ms) are used to approximate the boundary between direct/early and late components.</w:t>
+      </w:r>
     </w:p>
     <w:p>
       <w:pPr>
@@ -545,7 +537,46 @@
         <w:rPr>
           <w:rFonts w:hint="eastAsia"/>
         </w:rPr>
-        <w:t>相比之下，晚期混响的建模精度表现出明显的条件依赖性。通过定义 RT60 精度（RT60 accuracy = 1 − RT60 error），可以观察到，在长混响条件下（Long / Back 与 Long / Center），RT60 精度下降至约 0.36，而在短且</w:t>
+        <w:t>相比之下，晚期混响的建模精度表现出明显的条件依赖性。</w:t>
+      </w:r>
+      <w:r>
+        <w:rPr>
+          <w:rFonts w:hint="eastAsia"/>
+          <w:lang w:val="en-US" w:eastAsia="zh-CN"/>
+        </w:rPr>
+        <w:t>正确的RT60标准</w:t>
+      </w:r>
+      <w:bookmarkStart w:id="0" w:name="_GoBack"/>
+      <w:bookmarkEnd w:id="0"/>
+      <w:r>
+        <w:rPr>
+          <w:rFonts w:hint="eastAsia"/>
+          <w:lang w:val="en-US" w:eastAsia="zh-CN"/>
+        </w:rPr>
+        <w:t>是通过pyroomacoustics的函数</w:t>
+      </w:r>
+      <w:r>
+        <w:rPr>
+          <w:rFonts w:ascii="宋体" w:hAnsi="宋体" w:eastAsia="宋体" w:cs="宋体"/>
+          <w:sz w:val="24"/>
+          <w:szCs w:val="24"/>
+        </w:rPr>
+        <w:t>experimental.rt60.measure_rt60()</w:t>
+      </w:r>
+      <w:r>
+        <w:rPr>
+          <w:rFonts w:hint="eastAsia" w:ascii="宋体" w:hAnsi="宋体" w:eastAsia="宋体" w:cs="宋体"/>
+          <w:sz w:val="24"/>
+          <w:szCs w:val="24"/>
+          <w:lang w:val="en-US" w:eastAsia="zh-CN"/>
+        </w:rPr>
+        <w:t>计算的。</w:t>
+      </w:r>
+      <w:r>
+        <w:rPr>
+          <w:rFonts w:hint="eastAsia"/>
+        </w:rPr>
+        <w:t>通过定义 RT60 精度（RT60 accuracy = 1 − RT60 error），可以观察到，在长混响条件下（Long / Back 与 Long / Center），RT60 精度下降至约 0.36，而在短且</w:t>
       </w:r>
       <w:r>
         <w:rPr>
@@ -727,15 +758,7 @@
         <w:rPr>
           <w:rFonts w:hint="eastAsia"/>
         </w:rPr>
-        <w:t>或非对称声像条件</w:t>
-      </w:r>
-      <w:bookmarkStart w:id="0" w:name="_GoBack"/>
-      <w:bookmarkEnd w:id="0"/>
-      <w:r>
-        <w:rPr>
-          <w:rFonts w:hint="eastAsia"/>
-        </w:rPr>
-        <w:t>）中表现最佳，而在混响结构较复杂</w:t>
+        <w:t>或非对称声像条件）中表现最佳，而在混响结构较复杂</w:t>
       </w:r>
       <w:r>
         <w:rPr>
@@ -788,7 +811,7 @@
   <w:docDefaults>
     <w:rPrDefault>
       <w:rPr>
-        <w:rFonts w:asciiTheme="minorHAnsi" w:hAnsiTheme="minorHAnsi" w:eastAsiaTheme="minorEastAsia" w:cstheme="minorBidi"/>
+        <w:rFonts w:ascii="Times New Roman" w:hAnsi="Times New Roman" w:eastAsia="宋体" w:cs="Times New Roman"/>
       </w:rPr>
     </w:rPrDefault>
     <w:pPrDefault/>
@@ -897,7 +920,7 @@
     <w:lsdException w:unhideWhenUsed="0" w:uiPriority="0" w:semiHidden="0" w:name="HTML Sample"/>
     <w:lsdException w:unhideWhenUsed="0" w:uiPriority="0" w:semiHidden="0" w:name="HTML Typewriter"/>
     <w:lsdException w:unhideWhenUsed="0" w:uiPriority="0" w:semiHidden="0" w:name="HTML Variable"/>
-    <w:lsdException w:unhideWhenUsed="0" w:uiPriority="0" w:name="Normal Table"/>
+    <w:lsdException w:qFormat="1" w:unhideWhenUsed="0" w:uiPriority="0" w:name="Normal Table"/>
     <w:lsdException w:unhideWhenUsed="0" w:uiPriority="0" w:semiHidden="0" w:name="annotation subject"/>
     <w:lsdException w:unhideWhenUsed="0" w:uiPriority="0" w:semiHidden="0" w:name="Table Simple 1"/>
     <w:lsdException w:unhideWhenUsed="0" w:uiPriority="0" w:semiHidden="0" w:name="Table Simple 2"/>
@@ -1067,6 +1090,7 @@
   <w:style w:type="table" w:default="1" w:styleId="2">
     <w:name w:val="Normal Table"/>
     <w:semiHidden/>
+    <w:qFormat/>
     <w:uiPriority w:val="0"/>
     <w:tblPr>
       <w:tblCellMar>

</xml_diff>